<commit_message>
Automatische Sicherung 2026-07-21 12:44:01
</commit_message>
<xml_diff>
--- a/Christian_Derix_CV_PO_JUL_2026_2-Seiten-ausgewogen.docx
+++ b/Christian_Derix_CV_PO_JUL_2026_2-Seiten-ausgewogen.docx
@@ -98,7 +98,7 @@
           <w:tblLook w:val="05E0"/>
         </w:tblPrEx>
         <w:trPr>
-          <w:trHeight w:val="15698"/>
+          <w:trHeight w:val="13680"/>
         </w:trPr>
         <w:tc>
           <w:tcPr>
@@ -2747,7 +2747,7 @@
                 <w:b/>
                 <w:bCs/>
                 <w:color w:val="46464E"/>
-                <w:sz w:val="17"/>
+                <w:sz w:val="16"/>
                 <w:szCs w:val="18"/>
               </w:rPr>
               <w:t>Projekttransformation:</w:t>
@@ -2757,7 +2757,7 @@
                 <w:rStyle w:val="span"/>
                 <w:rFonts w:ascii="Fira Sans" w:eastAsia="Fira Sans" w:hAnsi="Fira Sans" w:cs="Fira Sans"/>
                 <w:color w:val="46464E"/>
-                <w:sz w:val="17"/>
+                <w:sz w:val="16"/>
                 <w:szCs w:val="18"/>
                 <w:bdr w:val="none" w:sz="0" w:space="0" w:color="auto"/>
                 <w:vertAlign w:val="baseline"/>
@@ -2791,7 +2791,7 @@
                 <w:b/>
                 <w:bCs/>
                 <w:color w:val="46464E"/>
-                <w:sz w:val="17"/>
+                <w:sz w:val="16"/>
                 <w:szCs w:val="18"/>
               </w:rPr>
               <w:t>Roadmap-Steuerung:</w:t>
@@ -2801,7 +2801,7 @@
                 <w:rStyle w:val="span"/>
                 <w:rFonts w:ascii="Fira Sans" w:eastAsia="Fira Sans" w:hAnsi="Fira Sans" w:cs="Fira Sans"/>
                 <w:color w:val="46464E"/>
-                <w:sz w:val="17"/>
+                <w:sz w:val="16"/>
                 <w:szCs w:val="18"/>
                 <w:bdr w:val="none" w:sz="0" w:space="0" w:color="auto"/>
                 <w:vertAlign w:val="baseline"/>
@@ -2835,7 +2835,7 @@
                 <w:b/>
                 <w:bCs/>
                 <w:color w:val="46464E"/>
-                <w:sz w:val="17"/>
+                <w:sz w:val="16"/>
                 <w:szCs w:val="18"/>
               </w:rPr>
               <w:t>Anforderungsmanagement:</w:t>
@@ -2845,7 +2845,7 @@
                 <w:rStyle w:val="span"/>
                 <w:rFonts w:ascii="Fira Sans" w:eastAsia="Fira Sans" w:hAnsi="Fira Sans" w:cs="Fira Sans"/>
                 <w:color w:val="46464E"/>
-                <w:sz w:val="17"/>
+                <w:sz w:val="16"/>
                 <w:szCs w:val="18"/>
                 <w:bdr w:val="none" w:sz="0" w:space="0" w:color="auto"/>
                 <w:vertAlign w:val="baseline"/>
@@ -2879,7 +2879,7 @@
                 <w:b/>
                 <w:bCs/>
                 <w:color w:val="46464E"/>
-                <w:sz w:val="17"/>
+                <w:sz w:val="16"/>
                 <w:szCs w:val="18"/>
               </w:rPr>
               <w:t>Teamkoordination:</w:t>
@@ -2889,7 +2889,7 @@
                 <w:rStyle w:val="span"/>
                 <w:rFonts w:ascii="Fira Sans" w:eastAsia="Fira Sans" w:hAnsi="Fira Sans" w:cs="Fira Sans"/>
                 <w:color w:val="46464E"/>
-                <w:sz w:val="17"/>
+                <w:sz w:val="16"/>
                 <w:szCs w:val="18"/>
                 <w:bdr w:val="none" w:sz="0" w:space="0" w:color="auto"/>
                 <w:vertAlign w:val="baseline"/>
@@ -2923,7 +2923,7 @@
                 <w:b/>
                 <w:bCs/>
                 <w:color w:val="46464E"/>
-                <w:sz w:val="17"/>
+                <w:sz w:val="16"/>
                 <w:szCs w:val="18"/>
               </w:rPr>
               <w:t>Backlog-Management:</w:t>
@@ -2933,7 +2933,7 @@
                 <w:rStyle w:val="span"/>
                 <w:rFonts w:ascii="Fira Sans" w:eastAsia="Fira Sans" w:hAnsi="Fira Sans" w:cs="Fira Sans"/>
                 <w:color w:val="46464E"/>
-                <w:sz w:val="17"/>
+                <w:sz w:val="16"/>
                 <w:szCs w:val="18"/>
                 <w:bdr w:val="none" w:sz="0" w:space="0" w:color="auto"/>
                 <w:vertAlign w:val="baseline"/>
@@ -2950,7 +2950,7 @@
                 <w:bottom w:val="none" w:sz="0" w:space="0" w:color="auto"/>
                 <w:right w:val="none" w:sz="0" w:space="0" w:color="auto"/>
               </w:pBdr>
-              <w:spacing w:before="0" w:after="0" w:line="260" w:lineRule="exact"/>
+              <w:spacing w:before="0" w:after="0" w:line="60" w:lineRule="exact"/>
               <w:ind w:left="300" w:right="0"/>
               <w:rPr>
                 <w:rStyle w:val="documentskn-mlk8parentContainerright-box"/>
@@ -3030,7 +3030,7 @@
                 <w:bottom w:val="none" w:sz="0" w:space="0" w:color="auto"/>
                 <w:right w:val="none" w:sz="0" w:space="0" w:color="auto"/>
               </w:pBdr>
-              <w:spacing w:before="0" w:after="0" w:line="260" w:lineRule="exact"/>
+              <w:spacing w:before="0" w:after="0" w:line="60" w:lineRule="exact"/>
               <w:ind w:left="300" w:right="0"/>
               <w:rPr>
                 <w:rStyle w:val="documentskn-mlk8parentContainerright-box"/>
@@ -3187,7 +3187,7 @@
                 <w:b/>
                 <w:bCs/>
                 <w:color w:val="46464E"/>
-                <w:sz w:val="17"/>
+                <w:sz w:val="16"/>
                 <w:szCs w:val="18"/>
               </w:rPr>
               <w:t>Federführende Leitung des Shop-Relaunchs:</w:t>
@@ -3197,7 +3197,7 @@
                 <w:rStyle w:val="span"/>
                 <w:rFonts w:ascii="Fira Sans" w:eastAsia="Fira Sans" w:hAnsi="Fira Sans" w:cs="Fira Sans"/>
                 <w:color w:val="46464E"/>
-                <w:sz w:val="17"/>
+                <w:sz w:val="16"/>
                 <w:szCs w:val="18"/>
                 <w:bdr w:val="none" w:sz="0" w:space="0" w:color="auto"/>
                 <w:vertAlign w:val="baseline"/>
@@ -3211,7 +3211,7 @@
                 <w:b/>
                 <w:bCs/>
                 <w:color w:val="46464E"/>
-                <w:sz w:val="17"/>
+                <w:sz w:val="16"/>
                 <w:szCs w:val="18"/>
               </w:rPr>
               <w:t>Headless-Architektur (Storyblok &amp; Next.js)</w:t>
@@ -3221,7 +3221,7 @@
                 <w:rStyle w:val="span"/>
                 <w:rFonts w:ascii="Fira Sans" w:eastAsia="Fira Sans" w:hAnsi="Fira Sans" w:cs="Fira Sans"/>
                 <w:color w:val="46464E"/>
-                <w:sz w:val="17"/>
+                <w:sz w:val="16"/>
                 <w:szCs w:val="18"/>
                 <w:bdr w:val="none" w:sz="0" w:space="0" w:color="auto"/>
                 <w:vertAlign w:val="baseline"/>
@@ -3255,7 +3255,7 @@
                 <w:b/>
                 <w:bCs/>
                 <w:color w:val="46464E"/>
-                <w:sz w:val="17"/>
+                <w:sz w:val="16"/>
                 <w:szCs w:val="18"/>
               </w:rPr>
               <w:t>Internationale Plattform-Verantwortung:</w:t>
@@ -3265,7 +3265,7 @@
                 <w:rStyle w:val="span"/>
                 <w:rFonts w:ascii="Fira Sans" w:eastAsia="Fira Sans" w:hAnsi="Fira Sans" w:cs="Fira Sans"/>
                 <w:color w:val="46464E"/>
-                <w:sz w:val="17"/>
+                <w:sz w:val="16"/>
                 <w:szCs w:val="18"/>
                 <w:bdr w:val="none" w:sz="0" w:space="0" w:color="auto"/>
                 <w:vertAlign w:val="baseline"/>
@@ -3279,7 +3279,7 @@
                 <w:b/>
                 <w:bCs/>
                 <w:color w:val="46464E"/>
-                <w:sz w:val="17"/>
+                <w:sz w:val="16"/>
                 <w:szCs w:val="18"/>
               </w:rPr>
               <w:t>fünf Länder-Webshops</w:t>
@@ -3289,7 +3289,7 @@
                 <w:rStyle w:val="span"/>
                 <w:rFonts w:ascii="Fira Sans" w:eastAsia="Fira Sans" w:hAnsi="Fira Sans" w:cs="Fira Sans"/>
                 <w:color w:val="46464E"/>
-                <w:sz w:val="17"/>
+                <w:sz w:val="16"/>
                 <w:szCs w:val="18"/>
                 <w:bdr w:val="none" w:sz="0" w:space="0" w:color="auto"/>
                 <w:vertAlign w:val="baseline"/>
@@ -3323,7 +3323,7 @@
                 <w:b/>
                 <w:bCs/>
                 <w:color w:val="46464E"/>
-                <w:sz w:val="17"/>
+                <w:sz w:val="16"/>
                 <w:szCs w:val="18"/>
               </w:rPr>
               <w:t>Daten-Engineering &amp; Produkt-Logik:</w:t>
@@ -3333,7 +3333,7 @@
                 <w:rStyle w:val="span"/>
                 <w:rFonts w:ascii="Fira Sans" w:eastAsia="Fira Sans" w:hAnsi="Fira Sans" w:cs="Fira Sans"/>
                 <w:color w:val="46464E"/>
-                <w:sz w:val="17"/>
+                <w:sz w:val="16"/>
                 <w:szCs w:val="18"/>
                 <w:bdr w:val="none" w:sz="0" w:space="0" w:color="auto"/>
                 <w:vertAlign w:val="baseline"/>
@@ -3347,7 +3347,7 @@
                 <w:b/>
                 <w:bCs/>
                 <w:color w:val="46464E"/>
-                <w:sz w:val="17"/>
+                <w:sz w:val="16"/>
                 <w:szCs w:val="18"/>
               </w:rPr>
               <w:t>interaktiven Konfiguratoren</w:t>
@@ -3357,7 +3357,7 @@
                 <w:rStyle w:val="span"/>
                 <w:rFonts w:ascii="Fira Sans" w:eastAsia="Fira Sans" w:hAnsi="Fira Sans" w:cs="Fira Sans"/>
                 <w:color w:val="46464E"/>
-                <w:sz w:val="17"/>
+                <w:sz w:val="16"/>
                 <w:szCs w:val="18"/>
                 <w:bdr w:val="none" w:sz="0" w:space="0" w:color="auto"/>
                 <w:vertAlign w:val="baseline"/>
@@ -3391,7 +3391,7 @@
                 <w:b/>
                 <w:bCs/>
                 <w:color w:val="46464E"/>
-                <w:sz w:val="17"/>
+                <w:sz w:val="16"/>
                 <w:szCs w:val="18"/>
               </w:rPr>
               <w:t>Nutzerzentrierte Feature-Entwicklung:</w:t>
@@ -3401,7 +3401,7 @@
                 <w:rStyle w:val="span"/>
                 <w:rFonts w:ascii="Fira Sans" w:eastAsia="Fira Sans" w:hAnsi="Fira Sans" w:cs="Fira Sans"/>
                 <w:color w:val="46464E"/>
-                <w:sz w:val="17"/>
+                <w:sz w:val="16"/>
                 <w:szCs w:val="18"/>
                 <w:bdr w:val="none" w:sz="0" w:space="0" w:color="auto"/>
                 <w:vertAlign w:val="baseline"/>
@@ -3415,7 +3415,7 @@
                 <w:b/>
                 <w:bCs/>
                 <w:color w:val="46464E"/>
-                <w:sz w:val="17"/>
+                <w:sz w:val="16"/>
                 <w:szCs w:val="18"/>
               </w:rPr>
               <w:t>messbaren Steigerung der Wiederkaufrate</w:t>
@@ -3425,7 +3425,7 @@
                 <w:rStyle w:val="span"/>
                 <w:rFonts w:ascii="Fira Sans" w:eastAsia="Fira Sans" w:hAnsi="Fira Sans" w:cs="Fira Sans"/>
                 <w:color w:val="46464E"/>
-                <w:sz w:val="17"/>
+                <w:sz w:val="16"/>
                 <w:szCs w:val="18"/>
                 <w:bdr w:val="none" w:sz="0" w:space="0" w:color="auto"/>
                 <w:vertAlign w:val="baseline"/>
@@ -3459,7 +3459,7 @@
                 <w:b/>
                 <w:bCs/>
                 <w:color w:val="46464E"/>
-                <w:sz w:val="17"/>
+                <w:sz w:val="16"/>
                 <w:szCs w:val="18"/>
               </w:rPr>
               <w:t>Conversion-Rate-Optimierung (CRO):</w:t>
@@ -3469,7 +3469,7 @@
                 <w:rStyle w:val="span"/>
                 <w:rFonts w:ascii="Fira Sans" w:eastAsia="Fira Sans" w:hAnsi="Fira Sans" w:cs="Fira Sans"/>
                 <w:color w:val="46464E"/>
-                <w:sz w:val="17"/>
+                <w:sz w:val="16"/>
                 <w:szCs w:val="18"/>
                 <w:bdr w:val="none" w:sz="0" w:space="0" w:color="auto"/>
                 <w:vertAlign w:val="baseline"/>
@@ -3483,7 +3483,7 @@
                 <w:b/>
                 <w:bCs/>
                 <w:color w:val="46464E"/>
-                <w:sz w:val="17"/>
+                <w:sz w:val="16"/>
                 <w:szCs w:val="18"/>
               </w:rPr>
               <w:t>Fact-Finder</w:t>
@@ -3493,7 +3493,7 @@
                 <w:rStyle w:val="span"/>
                 <w:rFonts w:ascii="Fira Sans" w:eastAsia="Fira Sans" w:hAnsi="Fira Sans" w:cs="Fira Sans"/>
                 <w:color w:val="46464E"/>
-                <w:sz w:val="17"/>
+                <w:sz w:val="16"/>
                 <w:szCs w:val="18"/>
                 <w:bdr w:val="none" w:sz="0" w:space="0" w:color="auto"/>
                 <w:vertAlign w:val="baseline"/>
@@ -3527,7 +3527,7 @@
                 <w:b/>
                 <w:bCs/>
                 <w:color w:val="46464E"/>
-                <w:sz w:val="17"/>
+                <w:sz w:val="16"/>
                 <w:szCs w:val="18"/>
               </w:rPr>
               <w:t>Product Discovery &amp; Validierung:</w:t>
@@ -3537,7 +3537,7 @@
                 <w:rStyle w:val="span"/>
                 <w:rFonts w:ascii="Fira Sans" w:eastAsia="Fira Sans" w:hAnsi="Fira Sans" w:cs="Fira Sans"/>
                 <w:color w:val="46464E"/>
-                <w:sz w:val="17"/>
+                <w:sz w:val="16"/>
                 <w:szCs w:val="18"/>
                 <w:bdr w:val="none" w:sz="0" w:space="0" w:color="auto"/>
                 <w:vertAlign w:val="baseline"/>
@@ -3551,7 +3551,7 @@
                 <w:b/>
                 <w:bCs/>
                 <w:color w:val="46464E"/>
-                <w:sz w:val="17"/>
+                <w:sz w:val="16"/>
                 <w:szCs w:val="18"/>
               </w:rPr>
               <w:t>Product-Market-Fits</w:t>
@@ -3561,7 +3561,7 @@
                 <w:rStyle w:val="span"/>
                 <w:rFonts w:ascii="Fira Sans" w:eastAsia="Fira Sans" w:hAnsi="Fira Sans" w:cs="Fira Sans"/>
                 <w:color w:val="46464E"/>
-                <w:sz w:val="17"/>
+                <w:sz w:val="16"/>
                 <w:szCs w:val="18"/>
                 <w:bdr w:val="none" w:sz="0" w:space="0" w:color="auto"/>
                 <w:vertAlign w:val="baseline"/>
@@ -3595,7 +3595,7 @@
                 <w:b/>
                 <w:bCs/>
                 <w:color w:val="46464E"/>
-                <w:sz w:val="17"/>
+                <w:sz w:val="16"/>
                 <w:szCs w:val="18"/>
               </w:rPr>
               <w:t>Stakeholder &amp; Leadership:</w:t>
@@ -3605,7 +3605,7 @@
                 <w:rStyle w:val="span"/>
                 <w:rFonts w:ascii="Fira Sans" w:eastAsia="Fira Sans" w:hAnsi="Fira Sans" w:cs="Fira Sans"/>
                 <w:color w:val="46464E"/>
-                <w:sz w:val="17"/>
+                <w:sz w:val="16"/>
                 <w:szCs w:val="18"/>
                 <w:bdr w:val="none" w:sz="0" w:space="0" w:color="auto"/>
                 <w:vertAlign w:val="baseline"/>
@@ -3622,7 +3622,7 @@
                 <w:bottom w:val="none" w:sz="0" w:space="0" w:color="auto"/>
                 <w:right w:val="none" w:sz="0" w:space="0" w:color="auto"/>
               </w:pBdr>
-              <w:spacing w:before="0" w:after="0" w:line="260" w:lineRule="exact"/>
+              <w:spacing w:before="0" w:after="0" w:line="60" w:lineRule="exact"/>
               <w:ind w:left="300" w:right="0"/>
               <w:rPr>
                 <w:rStyle w:val="documentskn-mlk8parentContainerright-box"/>
@@ -3803,7 +3803,7 @@
                 <w:b/>
                 <w:bCs/>
                 <w:color w:val="46464E"/>
-                <w:sz w:val="17"/>
+                <w:sz w:val="16"/>
                 <w:szCs w:val="18"/>
               </w:rPr>
               <w:t>Marketing-Verantwortung:</w:t>
@@ -3813,7 +3813,7 @@
                 <w:rStyle w:val="span"/>
                 <w:rFonts w:ascii="Fira Sans" w:eastAsia="Fira Sans" w:hAnsi="Fira Sans" w:cs="Fira Sans"/>
                 <w:color w:val="46464E"/>
-                <w:sz w:val="17"/>
+                <w:sz w:val="16"/>
                 <w:szCs w:val="18"/>
                 <w:bdr w:val="none" w:sz="0" w:space="0" w:color="auto"/>
                 <w:vertAlign w:val="baseline"/>
@@ -3847,7 +3847,7 @@
                 <w:b/>
                 <w:bCs/>
                 <w:color w:val="46464E"/>
-                <w:sz w:val="17"/>
+                <w:sz w:val="16"/>
                 <w:szCs w:val="18"/>
               </w:rPr>
               <w:t>Performance-Marketing:</w:t>
@@ -3857,7 +3857,7 @@
                 <w:rStyle w:val="span"/>
                 <w:rFonts w:ascii="Fira Sans" w:eastAsia="Fira Sans" w:hAnsi="Fira Sans" w:cs="Fira Sans"/>
                 <w:color w:val="46464E"/>
-                <w:sz w:val="17"/>
+                <w:sz w:val="16"/>
                 <w:szCs w:val="18"/>
                 <w:bdr w:val="none" w:sz="0" w:space="0" w:color="auto"/>
                 <w:vertAlign w:val="baseline"/>
@@ -3891,7 +3891,7 @@
                 <w:b/>
                 <w:bCs/>
                 <w:color w:val="46464E"/>
-                <w:sz w:val="17"/>
+                <w:sz w:val="16"/>
                 <w:szCs w:val="18"/>
               </w:rPr>
               <w:t>CRO &amp; UX:</w:t>
@@ -3901,7 +3901,7 @@
                 <w:rStyle w:val="span"/>
                 <w:rFonts w:ascii="Fira Sans" w:eastAsia="Fira Sans" w:hAnsi="Fira Sans" w:cs="Fira Sans"/>
                 <w:color w:val="46464E"/>
-                <w:sz w:val="17"/>
+                <w:sz w:val="16"/>
                 <w:szCs w:val="18"/>
                 <w:bdr w:val="none" w:sz="0" w:space="0" w:color="auto"/>
                 <w:vertAlign w:val="baseline"/>
@@ -3935,7 +3935,7 @@
                 <w:b/>
                 <w:bCs/>
                 <w:color w:val="46464E"/>
-                <w:sz w:val="17"/>
+                <w:sz w:val="16"/>
                 <w:szCs w:val="18"/>
               </w:rPr>
               <w:t>Kampagnen &amp; CRM:</w:t>
@@ -3945,7 +3945,7 @@
                 <w:rStyle w:val="span"/>
                 <w:rFonts w:ascii="Fira Sans" w:eastAsia="Fira Sans" w:hAnsi="Fira Sans" w:cs="Fira Sans"/>
                 <w:color w:val="46464E"/>
-                <w:sz w:val="17"/>
+                <w:sz w:val="16"/>
                 <w:szCs w:val="18"/>
                 <w:bdr w:val="none" w:sz="0" w:space="0" w:color="auto"/>
                 <w:vertAlign w:val="baseline"/>
@@ -3979,7 +3979,7 @@
                 <w:b/>
                 <w:bCs/>
                 <w:color w:val="46464E"/>
-                <w:sz w:val="17"/>
+                <w:sz w:val="16"/>
                 <w:szCs w:val="18"/>
               </w:rPr>
               <w:t>KPI-Reporting:</w:t>
@@ -3989,7 +3989,7 @@
                 <w:rStyle w:val="span"/>
                 <w:rFonts w:ascii="Fira Sans" w:eastAsia="Fira Sans" w:hAnsi="Fira Sans" w:cs="Fira Sans"/>
                 <w:color w:val="46464E"/>
-                <w:sz w:val="17"/>
+                <w:sz w:val="16"/>
                 <w:szCs w:val="18"/>
                 <w:bdr w:val="none" w:sz="0" w:space="0" w:color="auto"/>
                 <w:vertAlign w:val="baseline"/>
@@ -4023,7 +4023,7 @@
                 <w:b/>
                 <w:bCs/>
                 <w:color w:val="46464E"/>
-                <w:sz w:val="17"/>
+                <w:sz w:val="16"/>
                 <w:szCs w:val="18"/>
               </w:rPr>
               <w:t>Schnittstellenfunktion:</w:t>
@@ -4033,7 +4033,7 @@
                 <w:rStyle w:val="span"/>
                 <w:rFonts w:ascii="Fira Sans" w:eastAsia="Fira Sans" w:hAnsi="Fira Sans" w:cs="Fira Sans"/>
                 <w:color w:val="46464E"/>
-                <w:sz w:val="17"/>
+                <w:sz w:val="16"/>
                 <w:szCs w:val="18"/>
                 <w:bdr w:val="none" w:sz="0" w:space="0" w:color="auto"/>
                 <w:vertAlign w:val="baseline"/>
@@ -4050,7 +4050,7 @@
                 <w:bottom w:val="none" w:sz="0" w:space="0" w:color="auto"/>
                 <w:right w:val="none" w:sz="0" w:space="0" w:color="auto"/>
               </w:pBdr>
-              <w:spacing w:before="0" w:after="0" w:line="260" w:lineRule="exact"/>
+              <w:spacing w:before="0" w:after="0" w:line="60" w:lineRule="exact"/>
               <w:ind w:left="300" w:right="0"/>
               <w:rPr>
                 <w:rStyle w:val="documentskn-mlk8parentContainerright-box"/>
@@ -4231,7 +4231,7 @@
                 <w:b/>
                 <w:bCs/>
                 <w:color w:val="46464E"/>
-                <w:sz w:val="17"/>
+                <w:sz w:val="16"/>
                 <w:szCs w:val="18"/>
               </w:rPr>
               <w:t>Projektleitung &amp; Beratung:</w:t>
@@ -4241,7 +4241,7 @@
                 <w:rStyle w:val="span"/>
                 <w:rFonts w:ascii="Fira Sans" w:eastAsia="Fira Sans" w:hAnsi="Fira Sans" w:cs="Fira Sans"/>
                 <w:color w:val="46464E"/>
-                <w:sz w:val="17"/>
+                <w:sz w:val="16"/>
                 <w:szCs w:val="18"/>
                 <w:bdr w:val="none" w:sz="0" w:space="0" w:color="auto"/>
                 <w:vertAlign w:val="baseline"/>
@@ -4275,7 +4275,7 @@
                 <w:b/>
                 <w:bCs/>
                 <w:color w:val="46464E"/>
-                <w:sz w:val="17"/>
+                <w:sz w:val="16"/>
                 <w:szCs w:val="18"/>
               </w:rPr>
               <w:t>UI/UX &amp; Technik:</w:t>
@@ -4285,7 +4285,7 @@
                 <w:rStyle w:val="span"/>
                 <w:rFonts w:ascii="Fira Sans" w:eastAsia="Fira Sans" w:hAnsi="Fira Sans" w:cs="Fira Sans"/>
                 <w:color w:val="46464E"/>
-                <w:sz w:val="17"/>
+                <w:sz w:val="16"/>
                 <w:szCs w:val="18"/>
                 <w:bdr w:val="none" w:sz="0" w:space="0" w:color="auto"/>
                 <w:vertAlign w:val="baseline"/>
@@ -4319,7 +4319,7 @@
                 <w:b/>
                 <w:bCs/>
                 <w:color w:val="46464E"/>
-                <w:sz w:val="17"/>
+                <w:sz w:val="16"/>
                 <w:szCs w:val="18"/>
               </w:rPr>
               <w:t>Requirements Engineering:</w:t>
@@ -4329,7 +4329,7 @@
                 <w:rStyle w:val="span"/>
                 <w:rFonts w:ascii="Fira Sans" w:eastAsia="Fira Sans" w:hAnsi="Fira Sans" w:cs="Fira Sans"/>
                 <w:color w:val="46464E"/>
-                <w:sz w:val="17"/>
+                <w:sz w:val="16"/>
                 <w:szCs w:val="18"/>
                 <w:bdr w:val="none" w:sz="0" w:space="0" w:color="auto"/>
                 <w:vertAlign w:val="baseline"/>
@@ -4363,7 +4363,7 @@
                 <w:b/>
                 <w:bCs/>
                 <w:color w:val="46464E"/>
-                <w:sz w:val="17"/>
+                <w:sz w:val="16"/>
                 <w:szCs w:val="18"/>
               </w:rPr>
               <w:t>Performance &amp; Lifecycle:</w:t>
@@ -4373,7 +4373,7 @@
                 <w:rStyle w:val="span"/>
                 <w:rFonts w:ascii="Fira Sans" w:eastAsia="Fira Sans" w:hAnsi="Fira Sans" w:cs="Fira Sans"/>
                 <w:color w:val="46464E"/>
-                <w:sz w:val="17"/>
+                <w:sz w:val="16"/>
                 <w:szCs w:val="18"/>
                 <w:bdr w:val="none" w:sz="0" w:space="0" w:color="auto"/>
                 <w:vertAlign w:val="baseline"/>
@@ -4390,7 +4390,7 @@
                 <w:bottom w:val="none" w:sz="0" w:space="0" w:color="auto"/>
                 <w:right w:val="none" w:sz="0" w:space="0" w:color="auto"/>
               </w:pBdr>
-              <w:spacing w:before="0" w:after="0" w:line="260" w:lineRule="exact"/>
+              <w:spacing w:before="0" w:after="0" w:line="60" w:lineRule="exact"/>
               <w:ind w:left="300" w:right="0"/>
               <w:rPr>
                 <w:rStyle w:val="documentskn-mlk8parentContainerright-box"/>
@@ -4571,7 +4571,7 @@
                 <w:b/>
                 <w:bCs/>
                 <w:color w:val="46464E"/>
-                <w:sz w:val="17"/>
+                <w:sz w:val="16"/>
                 <w:szCs w:val="18"/>
               </w:rPr>
               <w:t>E-Commerce-Steuerung:</w:t>
@@ -4581,7 +4581,7 @@
                 <w:rStyle w:val="span"/>
                 <w:rFonts w:ascii="Fira Sans" w:eastAsia="Fira Sans" w:hAnsi="Fira Sans" w:cs="Fira Sans"/>
                 <w:color w:val="46464E"/>
-                <w:sz w:val="17"/>
+                <w:sz w:val="16"/>
                 <w:szCs w:val="18"/>
                 <w:bdr w:val="none" w:sz="0" w:space="0" w:color="auto"/>
                 <w:vertAlign w:val="baseline"/>
@@ -4615,7 +4615,7 @@
                 <w:b/>
                 <w:bCs/>
                 <w:color w:val="46464E"/>
-                <w:sz w:val="17"/>
+                <w:sz w:val="16"/>
                 <w:szCs w:val="18"/>
               </w:rPr>
               <w:t>Performance &amp; CRM:</w:t>
@@ -4625,7 +4625,7 @@
                 <w:rStyle w:val="span"/>
                 <w:rFonts w:ascii="Fira Sans" w:eastAsia="Fira Sans" w:hAnsi="Fira Sans" w:cs="Fira Sans"/>
                 <w:color w:val="46464E"/>
-                <w:sz w:val="17"/>
+                <w:sz w:val="16"/>
                 <w:szCs w:val="18"/>
                 <w:bdr w:val="none" w:sz="0" w:space="0" w:color="auto"/>
                 <w:vertAlign w:val="baseline"/>
@@ -4659,7 +4659,7 @@
                 <w:b/>
                 <w:bCs/>
                 <w:color w:val="46464E"/>
-                <w:sz w:val="17"/>
+                <w:sz w:val="16"/>
                 <w:szCs w:val="18"/>
               </w:rPr>
               <w:t>UX, Prozesse &amp; KPIs:</w:t>
@@ -4669,7 +4669,7 @@
                 <w:rStyle w:val="span"/>
                 <w:rFonts w:ascii="Fira Sans" w:eastAsia="Fira Sans" w:hAnsi="Fira Sans" w:cs="Fira Sans"/>
                 <w:color w:val="46464E"/>
-                <w:sz w:val="17"/>
+                <w:sz w:val="16"/>
                 <w:szCs w:val="18"/>
                 <w:bdr w:val="none" w:sz="0" w:space="0" w:color="auto"/>
                 <w:vertAlign w:val="baseline"/>
@@ -4703,7 +4703,7 @@
                 <w:b/>
                 <w:bCs/>
                 <w:color w:val="46464E"/>
-                <w:sz w:val="17"/>
+                <w:sz w:val="16"/>
                 <w:szCs w:val="18"/>
               </w:rPr>
               <w:t>Vendor Management:</w:t>
@@ -4713,7 +4713,7 @@
                 <w:rStyle w:val="span"/>
                 <w:rFonts w:ascii="Fira Sans" w:eastAsia="Fira Sans" w:hAnsi="Fira Sans" w:cs="Fira Sans"/>
                 <w:color w:val="46464E"/>
-                <w:sz w:val="17"/>
+                <w:sz w:val="16"/>
                 <w:szCs w:val="18"/>
                 <w:bdr w:val="none" w:sz="0" w:space="0" w:color="auto"/>
                 <w:vertAlign w:val="baseline"/>
@@ -4730,7 +4730,7 @@
                 <w:bottom w:val="none" w:sz="0" w:space="0" w:color="auto"/>
                 <w:right w:val="none" w:sz="0" w:space="0" w:color="auto"/>
               </w:pBdr>
-              <w:spacing w:before="0" w:after="0" w:line="260" w:lineRule="exact"/>
+              <w:spacing w:before="0" w:after="0" w:line="60" w:lineRule="exact"/>
               <w:ind w:left="300" w:right="0"/>
               <w:rPr>
                 <w:rStyle w:val="documentskn-mlk8parentContainerright-box"/>
@@ -4894,7 +4894,7 @@
                 <w:bottom w:val="none" w:sz="0" w:space="0" w:color="auto"/>
                 <w:right w:val="none" w:sz="0" w:space="0" w:color="auto"/>
               </w:pBdr>
-              <w:spacing w:before="0" w:after="0" w:line="260" w:lineRule="exact"/>
+              <w:spacing w:before="0" w:after="0" w:line="60" w:lineRule="exact"/>
               <w:ind w:left="300" w:right="0"/>
               <w:rPr>
                 <w:rStyle w:val="documentskn-mlk8parentContainerright-box"/>
@@ -5058,7 +5058,7 @@
                 <w:bottom w:val="none" w:sz="0" w:space="0" w:color="auto"/>
                 <w:right w:val="none" w:sz="0" w:space="0" w:color="auto"/>
               </w:pBdr>
-              <w:spacing w:before="0" w:after="0" w:line="260" w:lineRule="exact"/>
+              <w:spacing w:before="0" w:after="0" w:line="60" w:lineRule="exact"/>
               <w:ind w:left="300" w:right="0"/>
               <w:rPr>
                 <w:rStyle w:val="documentskn-mlk8parentContainerright-box"/>
@@ -5445,7 +5445,7 @@
                 <w:bottom w:val="none" w:sz="0" w:space="0" w:color="auto"/>
                 <w:right w:val="none" w:sz="0" w:space="0" w:color="auto"/>
               </w:pBdr>
-              <w:spacing w:before="0" w:after="0" w:line="260" w:lineRule="exact"/>
+              <w:spacing w:before="0" w:after="0" w:line="60" w:lineRule="exact"/>
               <w:ind w:left="300" w:right="0"/>
               <w:rPr>
                 <w:rStyle w:val="documentskn-mlk8parentContainerright-box"/>
@@ -5625,7 +5625,7 @@
                 <w:bottom w:val="none" w:sz="0" w:space="0" w:color="auto"/>
                 <w:right w:val="none" w:sz="0" w:space="0" w:color="auto"/>
               </w:pBdr>
-              <w:spacing w:before="0" w:after="0" w:line="260" w:lineRule="exact"/>
+              <w:spacing w:before="0" w:after="0" w:line="60" w:lineRule="exact"/>
               <w:ind w:left="300" w:right="0"/>
               <w:rPr>
                 <w:rStyle w:val="documentskn-mlk8parentContainerright-box"/>
@@ -5805,7 +5805,7 @@
                 <w:bottom w:val="none" w:sz="0" w:space="0" w:color="auto"/>
                 <w:right w:val="none" w:sz="0" w:space="0" w:color="auto"/>
               </w:pBdr>
-              <w:spacing w:before="0" w:after="0" w:line="260" w:lineRule="exact"/>
+              <w:spacing w:before="0" w:after="0" w:line="60" w:lineRule="exact"/>
               <w:ind w:left="300" w:right="0"/>
               <w:rPr>
                 <w:rStyle w:val="documentskn-mlk8parentContainerright-box"/>

</xml_diff>